<commit_message>
Ahora si que si esta
</commit_message>
<xml_diff>
--- a/Memoria.docx
+++ b/Memoria.docx
@@ -19,25 +19,7 @@
           <w:sz w:val="40"/>
           <w:szCs w:val="40"/>
         </w:rPr>
-        <w:t xml:space="preserve">MEMORIA IMPLEMENTACIÓN DE AUDIO </w:t>
-      </w:r>
-      <w:r>
-        <w:rPr>
-          <w:b/>
-          <w:bCs/>
-          <w:sz w:val="40"/>
-          <w:szCs w:val="40"/>
-        </w:rPr>
-        <w:t xml:space="preserve">CON FMOD </w:t>
-      </w:r>
-      <w:r>
-        <w:rPr>
-          <w:b/>
-          <w:bCs/>
-          <w:sz w:val="40"/>
-          <w:szCs w:val="40"/>
-        </w:rPr>
-        <w:t>EN HAUNTED HOUSE VR</w:t>
+        <w:t>MEMORIA IMPLEMENTACIÓN DE AUDIO CON FMOD EN HAUNTED HOUSE VR</w:t>
       </w:r>
     </w:p>
     <w:p>
@@ -654,6 +636,27 @@
       </w:r>
     </w:p>
     <w:p>
+      <w:r>
+        <w:t xml:space="preserve">También se ha implementado el crujido de las puertas al moverse con un script que detecta cuando se están moviendo y que llama a un evento de </w:t>
+      </w:r>
+      <w:proofErr w:type="spellStart"/>
+      <w:r>
+        <w:t>fmod</w:t>
+      </w:r>
+      <w:proofErr w:type="spellEnd"/>
+      <w:r>
+        <w:t xml:space="preserve"> que tiene un </w:t>
+      </w:r>
+      <w:proofErr w:type="spellStart"/>
+      <w:r>
+        <w:t>multiinstrument</w:t>
+      </w:r>
+      <w:proofErr w:type="spellEnd"/>
+      <w:r>
+        <w:t xml:space="preserve"> con varios chirridos cortos para darle más inmersión e interactividad a la experiencia.</w:t>
+      </w:r>
+    </w:p>
+    <w:p>
       <w:pPr>
         <w:rPr>
           <w:b/>
@@ -746,32 +749,106 @@
         <w:t>ha implementado</w:t>
       </w:r>
       <w:r>
+        <w:t xml:space="preserve"> un </w:t>
+      </w:r>
+      <w:proofErr w:type="spellStart"/>
+      <w:r>
+        <w:t>parametro</w:t>
+      </w:r>
+      <w:proofErr w:type="spellEnd"/>
+      <w:r>
+        <w:t xml:space="preserve">, encargado de </w:t>
+      </w:r>
+      <w:r>
+        <w:t xml:space="preserve">determinar si los el </w:t>
+      </w:r>
+      <w:proofErr w:type="spellStart"/>
+      <w:r>
+        <w:t>track</w:t>
+      </w:r>
+      <w:proofErr w:type="spellEnd"/>
+      <w:r>
+        <w:t xml:space="preserve"> con los </w:t>
+      </w:r>
+      <w:proofErr w:type="spellStart"/>
+      <w:r>
+        <w:t>creepySounds</w:t>
+      </w:r>
+      <w:proofErr w:type="spellEnd"/>
+      <w:r>
+        <w:t xml:space="preserve"> del evento de ambiente sonarán, gracias a los valores del </w:t>
+      </w:r>
+      <w:proofErr w:type="spellStart"/>
+      <w:r>
+        <w:t>scatterer</w:t>
+      </w:r>
+      <w:proofErr w:type="spellEnd"/>
+      <w:r>
         <w:t xml:space="preserve"> </w:t>
       </w:r>
       <w:proofErr w:type="spellStart"/>
       <w:r>
-        <w:t>CreepySoundsController</w:t>
-      </w:r>
-      <w:proofErr w:type="spellEnd"/>
-      <w:r>
-        <w:t xml:space="preserve">, encargado de reproducir </w:t>
-      </w:r>
-      <w:r>
-        <w:t xml:space="preserve">el evento </w:t>
-      </w:r>
-      <w:proofErr w:type="spellStart"/>
-      <w:r>
-        <w:t>CreepySounds</w:t>
-      </w:r>
-      <w:proofErr w:type="spellEnd"/>
-      <w:r>
-        <w:t>,</w:t>
-      </w:r>
-      <w:r>
-        <w:t xml:space="preserve"> a intervalos irregulares y en posiciones 3D aleatorias alrededor del jugador. </w:t>
-      </w:r>
-      <w:r>
-        <w:t>Lo que hace que a veces el jugador se asuste porque sonó un golpe muy fuerte o se inquiete porque escuche el crujido de la madera al otro lado de la pared.</w:t>
+        <w:t>instrument</w:t>
+      </w:r>
+      <w:proofErr w:type="spellEnd"/>
+      <w:r>
+        <w:t xml:space="preserve"> min and </w:t>
+      </w:r>
+      <w:proofErr w:type="spellStart"/>
+      <w:r>
+        <w:t>max</w:t>
+      </w:r>
+      <w:proofErr w:type="spellEnd"/>
+      <w:r>
+        <w:t xml:space="preserve"> </w:t>
+      </w:r>
+      <w:proofErr w:type="spellStart"/>
+      <w:r>
+        <w:t>distance</w:t>
+      </w:r>
+      <w:proofErr w:type="spellEnd"/>
+      <w:r>
+        <w:t xml:space="preserve"> y usando el </w:t>
+      </w:r>
+      <w:proofErr w:type="spellStart"/>
+      <w:r>
+        <w:t>player</w:t>
+      </w:r>
+      <w:proofErr w:type="spellEnd"/>
+      <w:r>
+        <w:t xml:space="preserve"> como punto de referencia se reproducirán sonidos inquietantes aleatoriamente en un intervalo de tiempo también definido en el </w:t>
+      </w:r>
+      <w:proofErr w:type="spellStart"/>
+      <w:r>
+        <w:t>scatterer</w:t>
+      </w:r>
+      <w:proofErr w:type="spellEnd"/>
+      <w:r>
+        <w:t xml:space="preserve"> </w:t>
+      </w:r>
+      <w:proofErr w:type="spellStart"/>
+      <w:r>
+        <w:t>instrument</w:t>
+      </w:r>
+      <w:proofErr w:type="spellEnd"/>
+      <w:r>
+        <w:t xml:space="preserve"> en min </w:t>
+      </w:r>
+      <w:proofErr w:type="spellStart"/>
+      <w:r>
+        <w:t>max</w:t>
+      </w:r>
+      <w:proofErr w:type="spellEnd"/>
+      <w:r>
+        <w:t xml:space="preserve"> </w:t>
+      </w:r>
+      <w:proofErr w:type="spellStart"/>
+      <w:r>
+        <w:t>spawn</w:t>
+      </w:r>
+      <w:proofErr w:type="spellEnd"/>
+      <w:r>
+        <w:t xml:space="preserve"> Interval.</w:t>
       </w:r>
     </w:p>
     <w:p>
@@ -858,11 +935,36 @@
           <w:bCs/>
         </w:rPr>
       </w:pPr>
-      <w:r>
-        <w:rPr>
-          <w:b/>
-          <w:bCs/>
-        </w:rPr>
+    </w:p>
+    <w:p>
+      <w:pPr>
+        <w:rPr>
+          <w:b/>
+          <w:bCs/>
+        </w:rPr>
+      </w:pPr>
+    </w:p>
+    <w:p>
+      <w:pPr>
+        <w:rPr>
+          <w:b/>
+          <w:bCs/>
+        </w:rPr>
+      </w:pPr>
+    </w:p>
+    <w:p>
+      <w:pPr>
+        <w:rPr>
+          <w:b/>
+          <w:bCs/>
+        </w:rPr>
+      </w:pPr>
+      <w:r>
+        <w:rPr>
+          <w:b/>
+          <w:bCs/>
+        </w:rPr>
+        <w:lastRenderedPageBreak/>
         <w:t>5</w:t>
       </w:r>
       <w:r>
@@ -962,7 +1064,6 @@
     </w:p>
     <w:p>
       <w:r>
-        <w:lastRenderedPageBreak/>
         <w:t>Contiene</w:t>
       </w:r>
       <w:r>
@@ -985,8 +1086,13 @@
         <w:t>: base de ambiente opresor</w:t>
       </w:r>
       <w:r>
-        <w:t>.</w:t>
-      </w:r>
+        <w:t xml:space="preserve"> con </w:t>
+      </w:r>
+      <w:proofErr w:type="spellStart"/>
+      <w:r>
+        <w:t>CreepySounds</w:t>
+      </w:r>
+      <w:proofErr w:type="spellEnd"/>
     </w:p>
     <w:p>
       <w:pPr>
@@ -3157,7 +3263,7 @@
   <w:style w:type="paragraph" w:default="1" w:styleId="Normal">
     <w:name w:val="Normal"/>
     <w:qFormat/>
-    <w:rsid w:val="00DE15B7"/>
+    <w:rsid w:val="000E6B53"/>
   </w:style>
   <w:style w:type="paragraph" w:styleId="Ttulo1">
     <w:name w:val="heading 1"/>
@@ -3361,6 +3467,7 @@
   <w:style w:type="character" w:default="1" w:styleId="Fuentedeprrafopredeter">
     <w:name w:val="Default Paragraph Font"/>
     <w:uiPriority w:val="1"/>
+    <w:semiHidden/>
     <w:unhideWhenUsed/>
   </w:style>
   <w:style w:type="table" w:default="1" w:styleId="Tablanormal">

</xml_diff>